<commit_message>
Shorter, slower video script
</commit_message>
<xml_diff>
--- a/docs/Sabi_Video_Script.docx
+++ b/docs/Sabi_Video_Script.docx
@@ -7,12 +7,12 @@
         <w:pStyle w:val="Title"/>
       </w:pPr>
       <w:r>
-        <w:t>Sabi demo video: script for Loom (about 4 and a half minutes)</w:t>
+        <w:t>Sabi demo video: script for Loom (about 4 minutes)</w:t>
       </w:r>
     </w:p>
     <w:p>
       <w:r>
-        <w:t xml:space="preserve">How to use this: the </w:t>
+        <w:t xml:space="preserve">The </w:t>
       </w:r>
       <w:r>
         <w:rPr>
@@ -21,16 +21,7 @@
         <w:t>SAY</w:t>
       </w:r>
       <w:r>
-        <w:t xml:space="preserve"> lines are what you speak, word for word or close to it. The </w:t>
-      </w:r>
-      <w:r>
-        <w:rPr>
-          <w:b/>
-        </w:rPr>
-        <w:t>DO</w:t>
-      </w:r>
-      <w:r>
-        <w:t xml:space="preserve"> lines are what you click. Speak slowly and smile; nobody minds a small pause. Timings are a guide.</w:t>
+        <w:t xml:space="preserve"> lines are short on purpose. Say them slowly. Pause between lines. It is fine to stop and breathe. While you click, you don't need to talk.</w:t>
       </w:r>
     </w:p>
     <w:p>
@@ -70,10 +61,8 @@
         <w:pStyle w:val="ListNumber"/>
       </w:pPr>
       <w:r>
-        <w:t>Have a second tab ready with the GitHub README scrolled to the results tables:</w:t>
+        <w:t xml:space="preserve">Have a second tab open on the results: </w:t>
       </w:r>
-    </w:p>
-    <w:p>
       <w:r>
         <w:rPr>
           <w:i/>
@@ -86,7 +75,7 @@
         <w:pStyle w:val="ListNumber"/>
       </w:pPr>
       <w:r>
-        <w:t>Zoom the browser to 125%. Turn sound ON (the speaker chip at the top).</w:t>
+        <w:t>Zoom the browser to 125%. Turn sound ON.</w:t>
       </w:r>
     </w:p>
     <w:p>
@@ -94,7 +83,7 @@
         <w:pStyle w:val="ListNumber"/>
       </w:pPr>
       <w:r>
-        <w:t>In Loom choose Screen + Camera, and pick the incognito tab.</w:t>
+        <w:t>In Loom, choose Screen + Camera.</w:t>
       </w:r>
     </w:p>
     <w:p>
@@ -102,7 +91,7 @@
         <w:pStyle w:val="Heading1"/>
       </w:pPr>
       <w:r>
-        <w:t>1. Hello and the problem (0:00 to 0:35)</w:t>
+        <w:t>1. Hello (0:00 to 0:30)</w:t>
       </w:r>
     </w:p>
     <w:p>
@@ -113,7 +102,7 @@
         <w:t>DO:</w:t>
       </w:r>
       <w:r>
-        <w:t xml:space="preserve"> Start on the Sabi Arena welcome screen. Your face is in the Loom bubble.</w:t>
+        <w:t xml:space="preserve"> Start on the Sabi Arena welcome screen.</w:t>
       </w:r>
     </w:p>
     <w:p>
@@ -131,12 +120,22 @@
     </w:p>
     <w:p>
       <w:r>
-        <w:t>Every year more than a million Nigerian students write WAEC, and many more write BECE and Common Entrance. A lot of them now study with AI chatbots. But a normal chatbot just gives you the answer. You copy it, you feel ready, and then in the exam hall you're on your own and you don't know where to start.</w:t>
+        <w:t>Many Nigerian students now study with AI chatbots.</w:t>
       </w:r>
     </w:p>
     <w:p>
       <w:r>
-        <w:t>So we built Sabi. Sabi is an AI tutor that won't just hand you the answer. It asks you questions, it uses examples from Nigerian life, and it only gives more help when you're really stuck."</w:t>
+        <w:t>But chatbots just give the answer.</w:t>
+      </w:r>
+    </w:p>
+    <w:p>
+      <w:r>
+        <w:t>Students copy it, and then fail in the exam hall.</w:t>
+      </w:r>
+    </w:p>
+    <w:p>
+      <w:r>
+        <w:t>So we built Sabi. A tutor that helps you think, not copy."</w:t>
       </w:r>
     </w:p>
     <w:p>
@@ -144,18 +143,7 @@
         <w:pStyle w:val="Heading1"/>
       </w:pPr>
       <w:r>
-        <w:t>2. What Sabi is (0:35 to 1:00)</w:t>
-      </w:r>
-    </w:p>
-    <w:p>
-      <w:r>
-        <w:rPr>
-          <w:b/>
-        </w:rPr>
-        <w:t>DO:</w:t>
-      </w:r>
-      <w:r>
-        <w:t xml:space="preserve"> Stay on the welcome screen, or switch to the Hugging Face model page for a moment.</w:t>
+        <w:t>2. What Sabi is (0:30 to 0:50)</w:t>
       </w:r>
     </w:p>
     <w:p>
@@ -168,7 +156,12 @@
     </w:p>
     <w:p>
       <w:r>
-        <w:t>"Sabi is a fine-tune of N-ATLAS, Nigeria's own language model from NCAIR. We wrote six hundred tutoring conversations for WAEC Literature, Physics and Accounting, and trained N-ATLAS on them, so it learned to guide students instead of telling them. The trained model is public on Hugging Face, and it all comes to students through this game, Sabi Arena."</w:t>
+        <w:t>"Sabi is built on N-ATLAS, Nigeria's own AI model.</w:t>
+      </w:r>
+    </w:p>
+    <w:p>
+      <w:r>
+        <w:t>We trained it to guide students with questions and Nigerian examples."</w:t>
       </w:r>
     </w:p>
     <w:p>
@@ -176,7 +169,7 @@
         <w:pStyle w:val="Heading1"/>
       </w:pPr>
       <w:r>
-        <w:t>3. Signing up (1:00 to 1:30)</w:t>
+        <w:t>3. Signing up (0:50 to 1:20)</w:t>
       </w:r>
     </w:p>
     <w:p>
@@ -187,16 +180,52 @@
         <w:t>DO:</w:t>
       </w:r>
       <w:r>
-        <w:t xml:space="preserve"> Type a first and last name, for example Chidi and Okafor. Point at the line that says "Others see you as Chidi O." Pick the parrot avatar and tap it so it squawks. Tap </w:t>
+        <w:t xml:space="preserve"> Type Chidi and Okafor. Pick the parrot and tap it. Tap SS. Pick a state and a school. Tick the box. Press go.</w:t>
       </w:r>
+    </w:p>
+    <w:p>
       <w:r>
         <w:rPr>
           <w:b/>
         </w:rPr>
-        <w:t>SS</w:t>
+        <w:t>SAY</w:t>
       </w:r>
       <w:r>
-        <w:t>, pick a state, start typing a school and choose it from the list. Tick the consent box and press go.</w:t>
+        <w:t xml:space="preserve"> (while the form is on screen):</w:t>
+      </w:r>
+    </w:p>
+    <w:p>
+      <w:r>
+        <w:t>"Students pick their class: Primary, JSS or SS.</w:t>
+      </w:r>
+    </w:p>
+    <w:p>
+      <w:r>
+        <w:t>Other players only see 'Chidi O.'</w:t>
+      </w:r>
+    </w:p>
+    <w:p>
+      <w:r>
+        <w:t>The full name stays on the phone."</w:t>
+      </w:r>
+    </w:p>
+    <w:p>
+      <w:pPr>
+        <w:pStyle w:val="Heading1"/>
+      </w:pPr>
+      <w:r>
+        <w:t>4. The route (1:20 to 1:40)</w:t>
+      </w:r>
+    </w:p>
+    <w:p>
+      <w:r>
+        <w:rPr>
+          <w:b/>
+        </w:rPr>
+        <w:t>DO:</w:t>
+      </w:r>
+      <w:r>
+        <w:t xml:space="preserve"> Set the exam date and press Save. Point at "10 tasks".</w:t>
       </w:r>
     </w:p>
     <w:p>
@@ -209,7 +238,12 @@
     </w:p>
     <w:p>
       <w:r>
-        <w:t>"Students sign up with their class: Primary, JSS or SS, and they only see their own exams. Look here: other players only see 'Chidi O.' The full name never leaves the phone, and nothing is shared without permission, because most of our users are children."</w:t>
+        <w:t>"Students set their exam date and count down the days.</w:t>
+      </w:r>
+    </w:p>
+    <w:p>
+      <w:r>
+        <w:t>Each bus stop has ten questions."</w:t>
       </w:r>
     </w:p>
     <w:p>
@@ -217,7 +251,7 @@
         <w:pStyle w:val="Heading1"/>
       </w:pPr>
       <w:r>
-        <w:t>4. The route and the countdown (1:30 to 1:50)</w:t>
+        <w:t>5. Asking Sabi (1:40 to 2:40)</w:t>
       </w:r>
     </w:p>
     <w:p>
@@ -228,7 +262,13 @@
         <w:t>DO:</w:t>
       </w:r>
       <w:r>
-        <w:t xml:space="preserve"> On the route, set the exam date in the countdown box and press Save. Point at "10 tasks" on the first bus stop.</w:t>
+        <w:t xml:space="preserve"> Open the first bus stop. Tap Ask Sabi. Type: </w:t>
+      </w:r>
+      <w:r>
+        <w:rPr>
+          <w:i/>
+        </w:rPr>
+        <w:t>Abeg just tell me the answer</w:t>
       </w:r>
     </w:p>
     <w:p>
@@ -241,15 +281,7 @@
     </w:p>
     <w:p>
       <w:r>
-        <w:t>"Students set their own exam date, and Sabi counts down the days with them. Learning is a danfo route. Every bus stop is a round of ten exam questions."</w:t>
-      </w:r>
-    </w:p>
-    <w:p>
-      <w:pPr>
-        <w:pStyle w:val="Heading1"/>
-      </w:pPr>
-      <w:r>
-        <w:t>5. Asking Sabi for help (1:50 to 2:50)</w:t>
+        <w:t>"Watch what happens when I beg for the answer."</w:t>
       </w:r>
     </w:p>
     <w:p>
@@ -260,38 +292,7 @@
         <w:t>DO:</w:t>
       </w:r>
       <w:r>
-        <w:t xml:space="preserve"> Tap the first bus stop. Read the question out. Tap </w:t>
-      </w:r>
-      <w:r>
-        <w:rPr>
-          <w:b/>
-        </w:rPr>
-        <w:t>Ask Sabi</w:t>
-      </w:r>
-      <w:r>
-        <w:t xml:space="preserve"> and type:</w:t>
-      </w:r>
-    </w:p>
-    <w:p>
-      <w:r>
-        <w:rPr>
-          <w:i/>
-        </w:rPr>
-        <w:t>Abeg just tell me the answer</w:t>
-      </w:r>
-    </w:p>
-    <w:p>
-      <w:r>
-        <w:t xml:space="preserve">Wait for the reply. Tap </w:t>
-      </w:r>
-      <w:r>
-        <w:rPr>
-          <w:b/>
-        </w:rPr>
-        <w:t>Listen</w:t>
-      </w:r>
-      <w:r>
-        <w:t xml:space="preserve"> so it reads out loud.</w:t>
+        <w:t xml:space="preserve"> Wait for the reply. Tap Listen.</w:t>
       </w:r>
     </w:p>
     <w:p>
@@ -304,17 +305,17 @@
     </w:p>
     <w:p>
       <w:r>
-        <w:t>"This is the bit I'm proudest of. Watch what happens when I beg for the answer.</w:t>
+        <w:t>"Sabi doesn't give it to me.</w:t>
       </w:r>
     </w:p>
     <w:p>
       <w:r>
-        <w:t>(wait for the reply)</w:t>
+        <w:t>It uses a danfo example and asks me a question.</w:t>
       </w:r>
     </w:p>
     <w:p>
       <w:r>
-        <w:t>It doesn't give in. It brings in a danfo braking at a bus stop and asks me a question, like a good teacher would. And students can tap Listen to hear it."</w:t>
+        <w:t>And it can read out loud."</w:t>
       </w:r>
     </w:p>
     <w:p>
@@ -325,25 +326,7 @@
         <w:t>DO:</w:t>
       </w:r>
       <w:r>
-        <w:t xml:space="preserve"> Type a sensible next step, for example </w:t>
-      </w:r>
-      <w:r>
-        <w:rPr>
-          <w:i/>
-        </w:rPr>
-        <w:t>the final velocity is 0?</w:t>
-      </w:r>
-      <w:r>
-        <w:t xml:space="preserve"> and show the reply. Then close the chat, pick the right answer and watch it glide to </w:t>
-      </w:r>
-      <w:r>
-        <w:rPr>
-          <w:b/>
-        </w:rPr>
-        <w:t>Lock in answer</w:t>
-      </w:r>
-      <w:r>
-        <w:t>. Lock it in.</w:t>
+        <w:t xml:space="preserve"> Close the chat. Pick the right answer. Lock it in.</w:t>
       </w:r>
     </w:p>
     <w:p>
@@ -356,7 +339,7 @@
     </w:p>
     <w:p>
       <w:r>
-        <w:t>"When I take a step, Sabi builds on it. The marking is always done with an exact answer key, never the AI, so a student is never told they're right when they're wrong. And if they slip, the first try is free."</w:t>
+        <w:t>"Answers are always checked with an answer key, not the AI."</w:t>
       </w:r>
     </w:p>
     <w:p>
@@ -364,7 +347,7 @@
         <w:pStyle w:val="Heading1"/>
       </w:pPr>
       <w:r>
-        <w:t>6. Exam mode (2:50 to 3:20)</w:t>
+        <w:t>6. Exam mode (2:40 to 3:05)</w:t>
       </w:r>
     </w:p>
     <w:p>
@@ -375,16 +358,7 @@
         <w:t>DO:</w:t>
       </w:r>
       <w:r>
-        <w:t xml:space="preserve"> Close the lesson and open the stop again. Turn on </w:t>
-      </w:r>
-      <w:r>
-        <w:rPr>
-          <w:b/>
-        </w:rPr>
-        <w:t>Exam mode</w:t>
-      </w:r>
-      <w:r>
-        <w:t>, pick 10 minutes, answer two or three questions quickly, then close and reopen the review from a finished exam if you prepared one, or just show the timer.</w:t>
+        <w:t xml:space="preserve"> Close the lesson, open it again, and turn on Exam mode. Show the timer.</w:t>
       </w:r>
     </w:p>
     <w:p>
@@ -397,7 +371,17 @@
     </w:p>
     <w:p>
       <w:r>
-        <w:t>"Closer to the exam, students switch on exam mode. One clock for the whole stop, no hints, no Sabi, just like the exam hall. They can pick how many minutes they get. At the end they see every question, what they chose, the right answer and why."</w:t>
+        <w:t>"For exam practice, students turn on exam mode.</w:t>
+      </w:r>
+    </w:p>
+    <w:p>
+      <w:r>
+        <w:t>One timer. No hints.</w:t>
+      </w:r>
+    </w:p>
+    <w:p>
+      <w:r>
+        <w:t>At the end, they see what they got wrong, and why."</w:t>
       </w:r>
     </w:p>
     <w:p>
@@ -405,7 +389,7 @@
         <w:pStyle w:val="Heading1"/>
       </w:pPr>
       <w:r>
-        <w:t>7. Does it actually work? (3:20 to 4:05)</w:t>
+        <w:t>7. The results (3:05 to 3:40)</w:t>
       </w:r>
     </w:p>
     <w:p>
@@ -416,7 +400,7 @@
         <w:t>DO:</w:t>
       </w:r>
       <w:r>
-        <w:t xml:space="preserve"> Switch to the GitHub README tab showing the results tables.</w:t>
+        <w:t xml:space="preserve"> Switch to the GitHub results tab.</w:t>
       </w:r>
     </w:p>
     <w:p>
@@ -429,17 +413,22 @@
     </w:p>
     <w:p>
       <w:r>
-        <w:t>"We didn't just say it works, we measured it against the original N-ATLAS on six hundred and forty-two examples it never saw in training.</w:t>
+        <w:t>"We tested Sabi against the original N-ATLAS.</w:t>
       </w:r>
     </w:p>
     <w:p>
       <w:r>
-        <w:t>On five hundred and twenty-two exam questions, base N-ATLAS gave the answer away in its first reply thirty-two percent of the time. Sabi did it only two percent of the time.</w:t>
+        <w:t>Normal N-ATLAS gave away the answer thirty-two percent of the time.</w:t>
       </w:r>
     </w:p>
     <w:p>
       <w:r>
-        <w:t>In a hundred and twenty full conversations, Sabi held back the answer properly ninety-six percent of the time, against forty percent. And when a student stayed stuck, Sabi stepped in correctly ninety-six percent of the time, against forty-six. Every single student got to the right understanding."</w:t>
+        <w:t>Sabi, only two percent.</w:t>
+      </w:r>
+    </w:p>
+    <w:p>
+      <w:r>
+        <w:t>When students were stuck, Sabi helped them correctly ninety-six percent of the time."</w:t>
       </w:r>
     </w:p>
     <w:p>
@@ -447,7 +436,7 @@
         <w:pStyle w:val="Heading1"/>
       </w:pPr>
       <w:r>
-        <w:t>8. Close (4:05 to 4:35)</w:t>
+        <w:t>8. Close (3:40 to 4:00)</w:t>
       </w:r>
     </w:p>
     <w:p>
@@ -458,7 +447,7 @@
         <w:t>DO:</w:t>
       </w:r>
       <w:r>
-        <w:t xml:space="preserve"> Go back to the app route screen, or show the leaderboard.</w:t>
+        <w:t xml:space="preserve"> Go back to the app.</w:t>
       </w:r>
     </w:p>
     <w:p>
@@ -471,17 +460,22 @@
     </w:p>
     <w:p>
       <w:r>
-        <w:t>"Sabi works on a cheap phone, keeps going offline with guided hints, and lets students compete for their school and their state.</w:t>
+        <w:t>"Sabi works on a cheap phone, even offline.</w:t>
       </w:r>
     </w:p>
     <w:p>
       <w:r>
-        <w:t>Next, we want to run it with real students in Nigerian classrooms, add more subjects, and with NAIC's support, keep it online all day.</w:t>
+        <w:t>Next, we want to test it in real classrooms.</w:t>
       </w:r>
     </w:p>
     <w:p>
       <w:r>
-        <w:t>We're Team Sabi. Sabi doesn't give you the answer. It helps you sabi it. Thank you."</w:t>
+        <w:t>Sabi doesn't give you the answer. It helps you sabi it.</w:t>
+      </w:r>
+    </w:p>
+    <w:p>
+      <w:r>
+        <w:t>Thank you."</w:t>
       </w:r>
     </w:p>
     <w:p>
@@ -514,7 +508,7 @@
         <w:t>"Waking Sabi up"</w:t>
       </w:r>
       <w:r>
-        <w:t xml:space="preserve"> appears: just wait and keep talking; the first reply can take up to a minute.</w:t>
+        <w:t xml:space="preserve"> shows: just wait quietly. The first reply can take up to a minute. You can trim the wait in Loom later.</w:t>
       </w:r>
     </w:p>
     <w:p>
@@ -525,10 +519,10 @@
         <w:rPr>
           <w:b/>
         </w:rPr>
-        <w:t>Sabi gives too much away:</w:t>
+        <w:t>You stumble on a line:</w:t>
       </w:r>
       <w:r>
-        <w:t xml:space="preserve"> record that part again. Don't hide it with a cut.</w:t>
+        <w:t xml:space="preserve"> pause, then say it again. Trim the mistake in Loom afterwards.</w:t>
       </w:r>
     </w:p>
     <w:p>
@@ -542,21 +536,7 @@
         <w:t>The tunnel dies:</w:t>
       </w:r>
       <w:r>
-        <w:t xml:space="preserve"> restart the Kaggle cell, copy the new link, and send it to Claude.</w:t>
-      </w:r>
-    </w:p>
-    <w:p>
-      <w:pPr>
-        <w:pStyle w:val="ListBullet"/>
-      </w:pPr>
-      <w:r>
-        <w:rPr>
-          <w:b/>
-        </w:rPr>
-        <w:t>You run past 5 minutes:</w:t>
-      </w:r>
-      <w:r>
-        <w:t xml:space="preserve"> Loom free stops at 5. Shorten section 6 to one sentence.</w:t>
+        <w:t xml:space="preserve"> restart the Kaggle cell and send Claude the new link.</w:t>
       </w:r>
     </w:p>
     <w:sectPr>

</xml_diff>